<commit_message>
Add the viva preparation guide; align the contribution statement with it
Each member owns guideline stages and a continuous slide block:
extraction/cleaning/loading (4.1, 4.2, 4.4), transformation and insights
(4.3, 4.5), ML and Power BI (4.6, 4.7). Scripts, likely questions and
numbers are generated from reports/facts.json.

Co-Authored-By: Claude Opus 5.5 <noreply@anthropic.com>
Claude-Session: https://claude.ai/code/session_01CxnxnyBwAZDmmQ8iGF8Z2U
</commit_message>
<xml_diff>
--- a/submission/07_Contribution_Statement.docx
+++ b/submission/07_Contribution_Statement.docx
@@ -262,7 +262,7 @@
                 <w:sz w:val="22"/>
                 <w:szCs w:val="22"/>
               </w:rPr>
-              <w:t xml:space="preserve">[e.g. Data extraction, ETL pipeline and star-schema design (warehouse load, SCD Type 2 profile, validation gates)]</w:t>
+              <w:t xml:space="preserve">Data extraction, cleaning and the cleaning log, warehouse loading and the validation gates (guidelines 4.1, 4.2, 4.4)</w:t>
             </w:r>
           </w:p>
         </w:tc>
@@ -370,7 +370,7 @@
                 <w:sz w:val="22"/>
                 <w:szCs w:val="22"/>
               </w:rPr>
-              <w:t xml:space="preserve">[e.g. Data cleaning and cleaning log, insights analysis and the Power BI dashboard]</w:t>
+              <w:t xml:space="preserve">Data transformation and feature engineering (aggregate facts, phase index, SCD Type 2 player profile) and the insights analysis (4.3, 4.5)</w:t>
             </w:r>
           </w:p>
         </w:tc>
@@ -478,7 +478,7 @@
                 <w:sz w:val="22"/>
                 <w:szCs w:val="22"/>
               </w:rPr>
-              <w:t xml:space="preserve">[e.g. Machine-learning models and evaluation, written report and viva presentation]</w:t>
+              <w:t xml:space="preserve">Machine-learning models and evaluation, the Power BI dashboard, and the written report (4.6, 4.7)</w:t>
             </w:r>
           </w:p>
         </w:tc>

</xml_diff>